<commit_message>
Remove referees from Tampere motivation letter
Co-Authored-By: Claude Opus 5.5 <noreply@anthropic.com>
Claude-Session: https://claude.ai/code/session_01NjdMuB9buEkMmyf7HkyEWg
</commit_message>
<xml_diff>
--- a/applications/Tampere_University_Staff_Scientist/Arunabha_Majumder_Motivation_Letter_Tampere.docx
+++ b/applications/Tampere_University_Staff_Scientist/Arunabha_Majumder_Motivation_Letter_Tampere.docx
@@ -172,18 +172,6 @@
           <w:i w:val="0"/>
         </w:rPr>
         <w:t>Why this matters to me. A strong research infrastructure multiplies the impact of every researcher who uses it. The combination of full-scale machines, a dedicated test area and close collaboration with industry in the Tampere ecosystem is a rare environment, and I would be glad to help maintain and develop it.</w:t>
-      </w:r>
-    </w:p>
-    <w:p>
-      <w:pPr>
-        <w:spacing w:after="160"/>
-      </w:pPr>
-      <w:r>
-        <w:rPr>
-          <w:b w:val="0"/>
-          <w:i w:val="0"/>
-        </w:rPr>
-        <w:t>Referees: Professor Shaoping Bai, Department of Materials and Production, Aalborg University ([email]); [second referee name, title, institution, email].</w:t>
       </w:r>
     </w:p>
     <w:p>

</xml_diff>